<commit_message>
Print the chain of custody on form 33.1 edition 22
Danny: from 29.10.2026 the app prints edition 22 (valid 15.10.2026).
- forms/form-33.1.* replaced and the blank pages re-embedded; F33
  re-measured from the new PDF (content moved up, page-2 header line
  moved, larger ISRAC logo).
- The Ministry-approval boxes now read "according to the consultant's
  declaration" (new key planDeclared) and "the plan was shown to the
  lab" (planShown). The edition-21 planApproved is not migrated.
- TPH GRO is a fixed column: 8 fixed analyses, 4 open columns. Records
  that had it as an open column are folded into the fixed one.

Co-Authored-By: Claude Opus 5.5 <noreply@anthropic.com>
</commit_message>
<xml_diff>
--- a/forms/form-33.1.docx
+++ b/forms/form-33.1.docx
@@ -2,20 +2,6 @@
 <file path=word/document.xml><?xml version="1.0" encoding="utf-8"?>
 <w:document xmlns:wpc="http://schemas.microsoft.com/office/word/2010/wordprocessingCanvas" xmlns:cx="http://schemas.microsoft.com/office/drawing/2014/chartex" xmlns:cx1="http://schemas.microsoft.com/office/drawing/2015/9/8/chartex" xmlns:cx2="http://schemas.microsoft.com/office/drawing/2015/10/21/chartex" xmlns:cx3="http://schemas.microsoft.com/office/drawing/2016/5/9/chartex" xmlns:cx4="http://schemas.microsoft.com/office/drawing/2016/5/10/chartex" xmlns:cx5="http://schemas.microsoft.com/office/drawing/2016/5/11/chartex" xmlns:cx6="http://schemas.microsoft.com/office/drawing/2016/5/12/chartex" xmlns:cx7="http://schemas.microsoft.com/office/drawing/2016/5/13/chartex" xmlns:cx8="http://schemas.microsoft.com/office/drawing/2016/5/14/chartex" xmlns:mc="http://schemas.openxmlformats.org/markup-compatibility/2006" xmlns:aink="http://schemas.microsoft.com/office/drawing/2016/ink" xmlns:am3d="http://schemas.microsoft.com/office/drawing/2017/model3d" xmlns:o="urn:schemas-microsoft-com:office:office" xmlns:oel="http://schemas.microsoft.com/office/2019/extlst" xmlns:r="http://schemas.openxmlformats.org/officeDocument/2006/relationships" xmlns:m="http://schemas.openxmlformats.org/officeDocument/2006/math" xmlns:v="urn:schemas-microsoft-com:vml" xmlns:wp14="http://schemas.microsoft.com/office/word/2010/wordprocessingDrawing" xmlns:wp="http://schemas.openxmlformats.org/drawingml/2006/wordprocessingDrawing" xmlns:w10="urn:schemas-microsoft-com:office:word" xmlns:w="http://schemas.openxmlformats.org/wordprocessingml/2006/main" xmlns:w14="http://schemas.microsoft.com/office/word/2010/wordml" xmlns:w15="http://schemas.microsoft.com/office/word/2012/wordml" xmlns:w16cex="http://schemas.microsoft.com/office/word/2018/wordml/cex" xmlns:w16cid="http://schemas.microsoft.com/office/word/2016/wordml/cid" xmlns:w16="http://schemas.microsoft.com/office/word/2018/wordml" xmlns:w16du="http://schemas.microsoft.com/office/word/2023/wordml/word16du" xmlns:w16sdtdh="http://schemas.microsoft.com/office/word/2020/wordml/sdtdatahash" xmlns:w16sdtfl="http://schemas.microsoft.com/office/word/2024/wordml/sdtformatlock" xmlns:w16se="http://schemas.microsoft.com/office/word/2015/wordml/symex" xmlns:wpg="http://schemas.microsoft.com/office/word/2010/wordprocessingGroup" xmlns:wpi="http://schemas.microsoft.com/office/word/2010/wordprocessingInk" xmlns:wne="http://schemas.microsoft.com/office/word/2006/wordml" xmlns:wps="http://schemas.microsoft.com/office/word/2010/wordprocessingShape" mc:Ignorable="w14 w15 w16se w16cid w16 w16cex w16sdtdh w16sdtfl w16du wp14">
   <w:body>
-    <w:p>
-      <w:pPr>
-        <w:widowControl w:val="0"/>
-        <w:rPr>
-          <w:rFonts w:asciiTheme="minorBidi" w:hAnsiTheme="minorBidi" w:cstheme="minorBidi" w:hint="cs"/>
-          <w:b/>
-          <w:bCs/>
-          <w:color w:val="0D0D0D" w:themeColor="text1" w:themeTint="F2"/>
-          <w:sz w:val="20"/>
-          <w:szCs w:val="20"/>
-          <w:rtl/>
-        </w:rPr>
-      </w:pPr>
-    </w:p>
     <w:p>
       <w:pPr>
         <w:widowControl w:val="0"/>
@@ -84,7 +70,7 @@
             <w:pPr>
               <w:widowControl w:val="0"/>
               <w:rPr>
-                <w:rFonts w:asciiTheme="minorBidi" w:hAnsiTheme="minorBidi" w:cstheme="minorBidi"/>
+                <w:rFonts w:asciiTheme="minorBidi" w:hAnsiTheme="minorBidi" w:cstheme="minorBidi" w:hint="cs"/>
                 <w:color w:val="0D0D0D" w:themeColor="text1" w:themeTint="F2"/>
                 <w:sz w:val="20"/>
                 <w:szCs w:val="20"/>
@@ -1310,7 +1296,7 @@
               <w:widowControl w:val="0"/>
               <w:jc w:val="center"/>
               <w:rPr>
-                <w:rFonts w:asciiTheme="minorBidi" w:hAnsiTheme="minorBidi" w:cstheme="minorBidi" w:hint="cs"/>
+                <w:rFonts w:asciiTheme="minorBidi" w:hAnsiTheme="minorBidi" w:cstheme="minorBidi"/>
                 <w:b/>
                 <w:bCs/>
                 <w:color w:val="0D0D0D" w:themeColor="text1" w:themeTint="F2"/>
@@ -1319,6 +1305,17 @@
                 <w:rtl/>
               </w:rPr>
             </w:pPr>
+            <w:r>
+              <w:rPr>
+                <w:rFonts w:asciiTheme="minorBidi" w:hAnsiTheme="minorBidi" w:cstheme="minorBidi"/>
+                <w:b/>
+                <w:bCs/>
+                <w:color w:val="0D0D0D" w:themeColor="text1" w:themeTint="F2"/>
+                <w:sz w:val="16"/>
+                <w:szCs w:val="16"/>
+              </w:rPr>
+              <w:t>TPH GRO</w:t>
+            </w:r>
           </w:p>
         </w:tc>
         <w:tc>
@@ -2522,7 +2519,7 @@
             <w:pPr>
               <w:widowControl w:val="0"/>
               <w:rPr>
-                <w:rFonts w:asciiTheme="minorBidi" w:hAnsiTheme="minorBidi" w:cstheme="minorBidi"/>
+                <w:rFonts w:asciiTheme="minorBidi" w:hAnsiTheme="minorBidi" w:cstheme="minorBidi" w:hint="cs"/>
                 <w:b/>
                 <w:bCs/>
                 <w:color w:val="0D0D0D" w:themeColor="text1" w:themeTint="F2"/>
@@ -6575,7 +6572,7 @@
           <w:szCs w:val="16"/>
           <w:rtl/>
         </w:rPr>
-        <w:t xml:space="preserve">הדיגום </w:t>
+        <w:t>הסקר בוצע</w:t>
       </w:r>
       <w:r>
         <w:rPr>
@@ -6585,7 +6582,17 @@
           <w:szCs w:val="16"/>
           <w:rtl/>
         </w:rPr>
-        <w:t>בוצע לפי תוכנית דיגום מאושרת על ידי המשרד להגנת הסביבה.</w:t>
+        <w:t xml:space="preserve"> לפי תוכנית דיגום מאושרת על ידי המשרד להגנת הסביבה</w:t>
+      </w:r>
+      <w:r>
+        <w:rPr>
+          <w:rFonts w:asciiTheme="minorBidi" w:hAnsiTheme="minorBidi" w:cstheme="minorBidi" w:hint="cs"/>
+          <w:color w:val="0D0D0D" w:themeColor="text1" w:themeTint="F2"/>
+          <w:sz w:val="16"/>
+          <w:szCs w:val="16"/>
+          <w:rtl/>
+        </w:rPr>
+        <w:t>, על פי הצהרת יועץ.</w:t>
       </w:r>
     </w:p>
     <w:p>
@@ -6611,20 +6618,20 @@
           <w:lang w:val="he-IL"/>
         </w:rPr>
         <w:drawing>
-          <wp:anchor distT="0" distB="0" distL="114300" distR="114300" simplePos="0" relativeHeight="251660288" behindDoc="0" locked="0" layoutInCell="1" allowOverlap="1" wp14:anchorId="47B5921A" wp14:editId="7391071D">
+          <wp:anchor distT="0" distB="0" distL="114300" distR="114300" simplePos="0" relativeHeight="251660288" behindDoc="0" locked="0" layoutInCell="1" allowOverlap="1" wp14:anchorId="47B5921A" wp14:editId="664E1C6D">
             <wp:simplePos x="0" y="0"/>
             <wp:positionH relativeFrom="margin">
               <wp:align>right</wp:align>
             </wp:positionH>
             <wp:positionV relativeFrom="paragraph">
-              <wp:posOffset>140970</wp:posOffset>
+              <wp:posOffset>140335</wp:posOffset>
             </wp:positionV>
-            <wp:extent cx="251940" cy="151200"/>
-            <wp:effectExtent l="0" t="0" r="0" b="1270"/>
+            <wp:extent cx="180000" cy="144000"/>
+            <wp:effectExtent l="0" t="0" r="0" b="8890"/>
             <wp:wrapNone/>
             <wp:docPr id="7" name="Picture 7" descr="Icon&#10;&#10;Description automatically generated"/>
             <wp:cNvGraphicFramePr>
-              <a:graphicFrameLocks xmlns:a="http://schemas.openxmlformats.org/drawingml/2006/main" noChangeAspect="1"/>
+              <a:graphicFrameLocks xmlns:a="http://schemas.openxmlformats.org/drawingml/2006/main"/>
             </wp:cNvGraphicFramePr>
             <a:graphic xmlns:a="http://schemas.openxmlformats.org/drawingml/2006/main">
               <a:graphicData uri="http://schemas.openxmlformats.org/drawingml/2006/picture">
@@ -6648,7 +6655,7 @@
                   <pic:spPr>
                     <a:xfrm>
                       <a:off x="0" y="0"/>
-                      <a:ext cx="251940" cy="151200"/>
+                      <a:ext cx="180000" cy="144000"/>
                     </a:xfrm>
                     <a:prstGeom prst="rect">
                       <a:avLst/>
@@ -6692,26 +6699,6 @@
           <w:szCs w:val="16"/>
           <w:rtl/>
         </w:rPr>
-        <w:t xml:space="preserve"> הוצג</w:t>
-      </w:r>
-      <w:r>
-        <w:rPr>
-          <w:rFonts w:asciiTheme="minorBidi" w:hAnsiTheme="minorBidi" w:cstheme="minorBidi" w:hint="cs"/>
-          <w:color w:val="0D0D0D" w:themeColor="text1" w:themeTint="F2"/>
-          <w:sz w:val="16"/>
-          <w:szCs w:val="16"/>
-          <w:rtl/>
-        </w:rPr>
-        <w:t>ה</w:t>
-      </w:r>
-      <w:r>
-        <w:rPr>
-          <w:rFonts w:asciiTheme="minorBidi" w:hAnsiTheme="minorBidi" w:cstheme="minorBidi" w:hint="cs"/>
-          <w:color w:val="0D0D0D" w:themeColor="text1" w:themeTint="F2"/>
-          <w:sz w:val="16"/>
-          <w:szCs w:val="16"/>
-          <w:rtl/>
-        </w:rPr>
         <w:t xml:space="preserve"> </w:t>
       </w:r>
       <w:r>
@@ -6722,7 +6709,27 @@
           <w:szCs w:val="16"/>
           <w:rtl/>
         </w:rPr>
-        <w:t>תוכנית מאושרת על ידי המשרד להגנת הסביבה</w:t>
+        <w:t>הסקר בוצע</w:t>
+      </w:r>
+      <w:r>
+        <w:rPr>
+          <w:rFonts w:asciiTheme="minorBidi" w:hAnsiTheme="minorBidi" w:cstheme="minorBidi"/>
+          <w:color w:val="0D0D0D" w:themeColor="text1" w:themeTint="F2"/>
+          <w:sz w:val="16"/>
+          <w:szCs w:val="16"/>
+          <w:rtl/>
+        </w:rPr>
+        <w:t xml:space="preserve"> </w:t>
+      </w:r>
+      <w:r>
+        <w:rPr>
+          <w:rFonts w:asciiTheme="minorBidi" w:hAnsiTheme="minorBidi" w:cstheme="minorBidi"/>
+          <w:color w:val="0D0D0D" w:themeColor="text1" w:themeTint="F2"/>
+          <w:sz w:val="16"/>
+          <w:szCs w:val="16"/>
+          <w:rtl/>
+        </w:rPr>
+        <w:t>לפי תוכנית דיגום מאושרת על ידי המשרד להגנת הסביבה</w:t>
       </w:r>
       <w:r>
         <w:rPr>
@@ -6732,7 +6739,17 @@
           <w:szCs w:val="16"/>
           <w:rtl/>
         </w:rPr>
-        <w:t xml:space="preserve"> למעבדה.</w:t>
+        <w:t xml:space="preserve">, </w:t>
+      </w:r>
+      <w:r>
+        <w:rPr>
+          <w:rFonts w:asciiTheme="minorBidi" w:hAnsiTheme="minorBidi" w:cstheme="minorBidi" w:hint="cs"/>
+          <w:color w:val="0D0D0D" w:themeColor="text1" w:themeTint="F2"/>
+          <w:sz w:val="16"/>
+          <w:szCs w:val="16"/>
+          <w:rtl/>
+        </w:rPr>
+        <w:t>התוכנית הוצגה למעבדה.</w:t>
       </w:r>
     </w:p>
     <w:p>
@@ -7650,20 +7667,6 @@
         <w:spacing w:line="276" w:lineRule="auto"/>
         <w:rPr>
           <w:rFonts w:asciiTheme="minorBidi" w:hAnsiTheme="minorBidi" w:cstheme="minorBidi"/>
-          <w:color w:val="0D0D0D" w:themeColor="text1" w:themeTint="F2"/>
-          <w:sz w:val="20"/>
-          <w:szCs w:val="20"/>
-          <w:u w:val="single"/>
-          <w:rtl/>
-        </w:rPr>
-      </w:pPr>
-    </w:p>
-    <w:p>
-      <w:pPr>
-        <w:widowControl w:val="0"/>
-        <w:spacing w:line="276" w:lineRule="auto"/>
-        <w:rPr>
-          <w:rFonts w:asciiTheme="minorBidi" w:hAnsiTheme="minorBidi" w:cstheme="minorBidi"/>
           <w:b/>
           <w:bCs/>
           <w:color w:val="0D0D0D" w:themeColor="text1" w:themeTint="F2"/>
@@ -7682,7 +7685,20 @@
           <w:szCs w:val="20"/>
           <w:rtl/>
         </w:rPr>
-        <w:t xml:space="preserve">אתר:                                                                                     </w:t>
+        <w:lastRenderedPageBreak/>
+        <w:t xml:space="preserve">                            </w:t>
+      </w:r>
+      <w:r>
+        <w:rPr>
+          <w:rFonts w:asciiTheme="minorBidi" w:hAnsiTheme="minorBidi" w:cstheme="minorBidi" w:hint="cs"/>
+          <w:b/>
+          <w:bCs/>
+          <w:color w:val="0D0D0D" w:themeColor="text1" w:themeTint="F2"/>
+          <w:sz w:val="20"/>
+          <w:szCs w:val="20"/>
+          <w:rtl/>
+        </w:rPr>
+        <w:t xml:space="preserve">אתר:                                                                           </w:t>
       </w:r>
       <w:r>
         <w:rPr>
@@ -7706,7 +7722,7 @@
           <w:szCs w:val="20"/>
           <w:rtl/>
         </w:rPr>
-        <w:t xml:space="preserve">:                                                                                  </w:t>
+        <w:t xml:space="preserve">:                                            </w:t>
       </w:r>
       <w:r>
         <w:rPr>
@@ -8508,7 +8524,7 @@
               <w:widowControl w:val="0"/>
               <w:jc w:val="center"/>
               <w:rPr>
-                <w:rFonts w:asciiTheme="minorBidi" w:hAnsiTheme="minorBidi" w:cstheme="minorBidi" w:hint="cs"/>
+                <w:rFonts w:asciiTheme="minorBidi" w:hAnsiTheme="minorBidi" w:cstheme="minorBidi"/>
                 <w:b/>
                 <w:bCs/>
                 <w:color w:val="0D0D0D" w:themeColor="text1" w:themeTint="F2"/>
@@ -8517,6 +8533,17 @@
                 <w:rtl/>
               </w:rPr>
             </w:pPr>
+            <w:r>
+              <w:rPr>
+                <w:rFonts w:asciiTheme="minorBidi" w:hAnsiTheme="minorBidi" w:cstheme="minorBidi"/>
+                <w:b/>
+                <w:bCs/>
+                <w:color w:val="0D0D0D" w:themeColor="text1" w:themeTint="F2"/>
+                <w:sz w:val="16"/>
+                <w:szCs w:val="16"/>
+              </w:rPr>
+              <w:t>TPH GRO</w:t>
+            </w:r>
           </w:p>
         </w:tc>
         <w:tc>
@@ -16634,21 +16661,7 @@
               <w:rFonts w:asciiTheme="minorBidi" w:hAnsiTheme="minorBidi" w:cstheme="minorBidi" w:hint="cs"/>
               <w:rtl/>
             </w:rPr>
-            <w:t>10</w:t>
-          </w:r>
-          <w:r>
-            <w:rPr>
-              <w:rFonts w:asciiTheme="minorBidi" w:hAnsiTheme="minorBidi" w:cstheme="minorBidi" w:hint="cs"/>
-              <w:rtl/>
-            </w:rPr>
-            <w:t>.0</w:t>
-          </w:r>
-          <w:r>
-            <w:rPr>
-              <w:rFonts w:asciiTheme="minorBidi" w:hAnsiTheme="minorBidi" w:cstheme="minorBidi" w:hint="cs"/>
-              <w:rtl/>
-            </w:rPr>
-            <w:t>9</w:t>
+            <w:t>15.10</w:t>
           </w:r>
           <w:r>
             <w:rPr>
@@ -16709,7 +16722,7 @@
               <w:rFonts w:asciiTheme="minorBidi" w:hAnsiTheme="minorBidi" w:cstheme="minorBidi" w:hint="cs"/>
               <w:rtl/>
             </w:rPr>
-            <w:t>1</w:t>
+            <w:t>2</w:t>
           </w:r>
         </w:p>
         <w:p>
@@ -16833,20 +16846,20 @@
         <w:szCs w:val="20"/>
       </w:rPr>
       <w:drawing>
-        <wp:anchor distT="0" distB="0" distL="114300" distR="114300" simplePos="0" relativeHeight="251671552" behindDoc="0" locked="0" layoutInCell="1" allowOverlap="1" wp14:anchorId="3F65ECA8" wp14:editId="62119708">
+        <wp:anchor distT="0" distB="0" distL="114300" distR="114300" simplePos="0" relativeHeight="251671552" behindDoc="0" locked="0" layoutInCell="1" allowOverlap="1" wp14:anchorId="3F65ECA8" wp14:editId="6F7D201F">
           <wp:simplePos x="0" y="0"/>
           <wp:positionH relativeFrom="margin">
             <wp:align>left</wp:align>
           </wp:positionH>
           <wp:positionV relativeFrom="paragraph">
-            <wp:posOffset>-536280</wp:posOffset>
+            <wp:posOffset>-536575</wp:posOffset>
           </wp:positionV>
-          <wp:extent cx="720000" cy="1001223"/>
-          <wp:effectExtent l="0" t="0" r="4445" b="8890"/>
+          <wp:extent cx="900000" cy="828000"/>
+          <wp:effectExtent l="0" t="0" r="0" b="0"/>
           <wp:wrapNone/>
           <wp:docPr id="1104941431" name="תמונה 3"/>
           <wp:cNvGraphicFramePr>
-            <a:graphicFrameLocks xmlns:a="http://schemas.openxmlformats.org/drawingml/2006/main" noChangeAspect="1"/>
+            <a:graphicFrameLocks xmlns:a="http://schemas.openxmlformats.org/drawingml/2006/main"/>
           </wp:cNvGraphicFramePr>
           <a:graphic xmlns:a="http://schemas.openxmlformats.org/drawingml/2006/main">
             <a:graphicData uri="http://schemas.openxmlformats.org/drawingml/2006/picture">
@@ -16873,7 +16886,7 @@
                 <pic:spPr bwMode="auto">
                   <a:xfrm>
                     <a:off x="0" y="0"/>
-                    <a:ext cx="720000" cy="1001223"/>
+                    <a:ext cx="900000" cy="828000"/>
                   </a:xfrm>
                   <a:prstGeom prst="rect">
                     <a:avLst/>
@@ -16904,20 +16917,20 @@
         <w:lang w:eastAsia="en-US"/>
       </w:rPr>
       <w:drawing>
-        <wp:anchor distT="0" distB="0" distL="114300" distR="114300" simplePos="0" relativeHeight="251670528" behindDoc="0" locked="0" layoutInCell="1" allowOverlap="1" wp14:anchorId="7D7AC326" wp14:editId="057C2358">
+        <wp:anchor distT="0" distB="0" distL="114300" distR="114300" simplePos="0" relativeHeight="251670528" behindDoc="0" locked="0" layoutInCell="1" allowOverlap="1" wp14:anchorId="7D7AC326" wp14:editId="39986065">
           <wp:simplePos x="0" y="0"/>
           <wp:positionH relativeFrom="margin">
             <wp:align>right</wp:align>
           </wp:positionH>
           <wp:positionV relativeFrom="paragraph">
-            <wp:posOffset>-535305</wp:posOffset>
+            <wp:posOffset>-536575</wp:posOffset>
           </wp:positionV>
-          <wp:extent cx="858165" cy="1000800"/>
-          <wp:effectExtent l="0" t="0" r="0" b="8890"/>
+          <wp:extent cx="900000" cy="828000"/>
+          <wp:effectExtent l="0" t="0" r="0" b="0"/>
           <wp:wrapNone/>
           <wp:docPr id="1734500788" name="תמונה 5" descr="d:\Users\Danny\Documents\וזה אקולוגיה\אתר אינטרנט וגרפיקה\Vasa eco logo.png"/>
           <wp:cNvGraphicFramePr>
-            <a:graphicFrameLocks xmlns:a="http://schemas.openxmlformats.org/drawingml/2006/main" noChangeAspect="1"/>
+            <a:graphicFrameLocks xmlns:a="http://schemas.openxmlformats.org/drawingml/2006/main"/>
           </wp:cNvGraphicFramePr>
           <a:graphic xmlns:a="http://schemas.openxmlformats.org/drawingml/2006/main">
             <a:graphicData uri="http://schemas.openxmlformats.org/drawingml/2006/picture">
@@ -16944,7 +16957,7 @@
                 <pic:spPr bwMode="auto">
                   <a:xfrm>
                     <a:off x="0" y="0"/>
-                    <a:ext cx="858165" cy="1000800"/>
+                    <a:ext cx="900000" cy="828000"/>
                   </a:xfrm>
                   <a:prstGeom prst="rect">
                     <a:avLst/>

</xml_diff>